<commit_message>
Update estimate and cover letter based on  overhaul and - total integration
</commit_message>
<xml_diff>
--- a/Vancouver_Bridge_Club_Website_Estimate.docx
+++ b/Vancouver_Bridge_Club_Website_Estimate.docx
@@ -8,6 +8,7 @@
       </w:pPr>
       <w:r>
         <w:rPr>
+          <w:rFonts w:ascii="Calibri" w:hAnsi="Calibri"/>
           <w:b/>
           <w:color w:val="0477BF"/>
           <w:sz w:val="20"/>
@@ -21,22 +22,23 @@
       </w:pPr>
       <w:r>
         <w:rPr>
+          <w:rFonts w:ascii="Calibri" w:hAnsi="Calibri"/>
           <w:b/>
           <w:color w:val="024873"/>
-          <w:sz w:val="44"/>
+          <w:sz w:val="40"/>
         </w:rPr>
-        <w:t>Vancouver Bridge Club — Official Website Platform</w:t>
+        <w:t>Vancouver Bridge Club — Website Modernization &amp; Launch</w:t>
       </w:r>
     </w:p>
     <w:p>
       <w:pPr>
-        <w:spacing w:before="0" w:after="360"/>
+        <w:spacing w:before="0" w:after="320"/>
       </w:pPr>
       <w:r>
         <w:rPr>
-          <w:b w:val="0"/>
+          <w:rFonts w:ascii="Calibri" w:hAnsi="Calibri"/>
           <w:color w:val="475569"/>
-          <w:sz w:val="24"/>
+          <w:sz w:val="22"/>
         </w:rPr>
         <w:t>ACBL Unit 452 • Club Sanction #118489 • Southwest Washington</w:t>
       </w:r>
@@ -66,18 +68,19 @@
             <w:tcW w:type="dxa" w:w="4608"/>
             <w:shd w:fill="F2EDEB"/>
             <w:tcMar>
-              <w:top w:w="100" w:type="dxa"/>
-              <w:bottom w:w="100" w:type="dxa"/>
-              <w:left w:w="140" w:type="dxa"/>
-              <w:right w:w="140" w:type="dxa"/>
+              <w:top w:w="80" w:type="dxa"/>
+              <w:bottom w:w="80" w:type="dxa"/>
+              <w:left w:w="120" w:type="dxa"/>
+              <w:right w:w="120" w:type="dxa"/>
             </w:tcMar>
           </w:tcPr>
           <w:p>
             <w:pPr>
-              <w:spacing w:before="40" w:after="40"/>
+              <w:spacing w:before="20" w:after="20"/>
             </w:pPr>
             <w:r>
               <w:rPr>
+                <w:rFonts w:ascii="Calibri" w:hAnsi="Calibri"/>
                 <w:b/>
                 <w:color w:val="024873"/>
                 <w:sz w:val="18"/>
@@ -86,8 +89,9 @@
             </w:r>
             <w:r>
               <w:rPr>
+                <w:rFonts w:ascii="Calibri" w:hAnsi="Calibri"/>
                 <w:b/>
-                <w:sz w:val="20"/>
+                <w:sz w:val="19"/>
               </w:rPr>
               <w:t>Vancouver Bridge Club Board of Directors</w:t>
               <w:br/>
@@ -100,18 +104,19 @@
             <w:tcW w:type="dxa" w:w="4752"/>
             <w:shd w:fill="F2EDEB"/>
             <w:tcMar>
-              <w:top w:w="100" w:type="dxa"/>
-              <w:bottom w:w="100" w:type="dxa"/>
-              <w:left w:w="140" w:type="dxa"/>
-              <w:right w:w="140" w:type="dxa"/>
+              <w:top w:w="80" w:type="dxa"/>
+              <w:bottom w:w="80" w:type="dxa"/>
+              <w:left w:w="120" w:type="dxa"/>
+              <w:right w:w="120" w:type="dxa"/>
             </w:tcMar>
           </w:tcPr>
           <w:p>
             <w:pPr>
-              <w:spacing w:before="40" w:after="40"/>
+              <w:spacing w:before="20" w:after="20"/>
             </w:pPr>
             <w:r>
               <w:rPr>
+                <w:rFonts w:ascii="Calibri" w:hAnsi="Calibri"/>
                 <w:b/>
                 <w:color w:val="024873"/>
                 <w:sz w:val="18"/>
@@ -120,14 +125,15 @@
             </w:r>
             <w:r>
               <w:rPr>
+                <w:rFonts w:ascii="Calibri" w:hAnsi="Calibri"/>
                 <w:b/>
-                <w:sz w:val="20"/>
+                <w:sz w:val="19"/>
               </w:rPr>
               <w:t>Timothy Hufler</w:t>
               <w:br/>
               <w:t>Professional Web Developer</w:t>
               <w:br/>
-              <w:t>Email: support@highhandpro.com</w:t>
+              <w:t>support@highhandpro.com</w:t>
             </w:r>
           </w:p>
         </w:tc>
@@ -138,30 +144,32 @@
             <w:tcW w:type="dxa" w:w="4608"/>
             <w:shd w:fill="F2EDEB"/>
             <w:tcMar>
-              <w:top w:w="100" w:type="dxa"/>
-              <w:bottom w:w="100" w:type="dxa"/>
-              <w:left w:w="140" w:type="dxa"/>
-              <w:right w:w="140" w:type="dxa"/>
+              <w:top w:w="80" w:type="dxa"/>
+              <w:bottom w:w="80" w:type="dxa"/>
+              <w:left w:w="120" w:type="dxa"/>
+              <w:right w:w="120" w:type="dxa"/>
             </w:tcMar>
           </w:tcPr>
           <w:p>
             <w:pPr>
-              <w:spacing w:before="40" w:after="40"/>
+              <w:spacing w:before="20" w:after="20"/>
             </w:pPr>
             <w:r>
               <w:rPr>
+                <w:rFonts w:ascii="Calibri" w:hAnsi="Calibri"/>
                 <w:b/>
                 <w:color w:val="024873"/>
                 <w:sz w:val="18"/>
               </w:rPr>
-              <w:t xml:space="preserve">DATE ISSUED: </w:t>
+              <w:t xml:space="preserve">WORKING DEMO: </w:t>
             </w:r>
             <w:r>
               <w:rPr>
+                <w:rFonts w:ascii="Calibri" w:hAnsi="Calibri"/>
                 <w:b w:val="0"/>
-                <w:sz w:val="20"/>
+                <w:sz w:val="19"/>
               </w:rPr>
-              <w:t>August 2026</w:t>
+              <w:t>https://highhandpro.github.io/Vancouver-Bridge-Club/</w:t>
             </w:r>
           </w:p>
         </w:tc>
@@ -170,30 +178,32 @@
             <w:tcW w:type="dxa" w:w="4752"/>
             <w:shd w:fill="F2EDEB"/>
             <w:tcMar>
-              <w:top w:w="100" w:type="dxa"/>
-              <w:bottom w:w="100" w:type="dxa"/>
-              <w:left w:w="140" w:type="dxa"/>
-              <w:right w:w="140" w:type="dxa"/>
+              <w:top w:w="80" w:type="dxa"/>
+              <w:bottom w:w="80" w:type="dxa"/>
+              <w:left w:w="120" w:type="dxa"/>
+              <w:right w:w="120" w:type="dxa"/>
             </w:tcMar>
           </w:tcPr>
           <w:p>
             <w:pPr>
-              <w:spacing w:before="40" w:after="40"/>
+              <w:spacing w:before="20" w:after="20"/>
             </w:pPr>
             <w:r>
               <w:rPr>
+                <w:rFonts w:ascii="Calibri" w:hAnsi="Calibri"/>
                 <w:b/>
                 <w:color w:val="024873"/>
                 <w:sz w:val="18"/>
               </w:rPr>
-              <w:t xml:space="preserve">ESTIMATE VALIDITY: </w:t>
+              <w:t xml:space="preserve">ESTIMATE DATE: </w:t>
             </w:r>
             <w:r>
               <w:rPr>
+                <w:rFonts w:ascii="Calibri" w:hAnsi="Calibri"/>
                 <w:b w:val="0"/>
-                <w:sz w:val="20"/>
+                <w:sz w:val="19"/>
               </w:rPr>
-              <w:t>60 Days from Date of Issue</w:t>
+              <w:t>August 2026 (Valid 60 Days)</w:t>
             </w:r>
           </w:p>
         </w:tc>
@@ -201,150 +211,37 @@
     </w:tbl>
     <w:p>
       <w:pPr>
-        <w:spacing w:after="240"/>
+        <w:spacing w:after="200"/>
       </w:pPr>
     </w:p>
     <w:p>
       <w:pPr>
-        <w:spacing w:before="280" w:after="120"/>
+        <w:spacing w:before="240" w:after="80"/>
       </w:pPr>
       <w:r>
         <w:rPr>
+          <w:rFonts w:ascii="Calibri" w:hAnsi="Calibri"/>
           <w:b/>
           <w:color w:val="024873"/>
-          <w:sz w:val="28"/>
+          <w:sz w:val="26"/>
         </w:rPr>
-        <w:t>1. Executive Summary &amp; Project Purpose</w:t>
+        <w:t>1. Project Overview &amp; Working Demonstration</w:t>
       </w:r>
     </w:p>
     <w:p>
       <w:pPr>
-        <w:spacing w:after="160" w:line="276" w:lineRule="auto"/>
+        <w:spacing w:after="120" w:line="276" w:lineRule="auto"/>
       </w:pPr>
       <w:r>
-        <w:t>This proposal outlines the complete design, development, accessibility engineering, and cloud deployment of a modern, responsive, and senior-friendly official website platform for the Vancouver Bridge Club (ACBL Unit 452). The new digital platform replaces outdated, fragmented information channels with an intuitive, unified web hub designed to increase table attendance, streamline player communication, celebrate member achievements, and promote bridge education throughout Southwest Washington.</w:t>
+        <w:t>A full initial design overhaul and working prototype has already been built on the fly for the Vancouver Bridge Club. The board can preview the fully functional, responsive website live in their web browsers at:</w:t>
+        <w:br/>
       </w:r>
-    </w:p>
-    <w:p>
-      <w:pPr>
-        <w:pStyle w:val="ListBullet"/>
-        <w:spacing w:before="40" w:after="80" w:line="276" w:lineRule="auto"/>
-      </w:pPr>
-      <w:r>
-        <w:rPr>
-          <w:b/>
-          <w:color w:val="024873"/>
-        </w:rPr>
-        <w:t xml:space="preserve">High-Accessibility Senior Experience: </w:t>
-      </w:r>
-      <w:r>
-        <w:t>Built-in 1-click text scaling (Normal, Large, Extra Large) and seamless Dark/Light Mode with high-contrast readability.</w:t>
-      </w:r>
-    </w:p>
-    <w:p>
-      <w:pPr>
-        <w:pStyle w:val="ListBullet"/>
-        <w:spacing w:before="40" w:after="80" w:line="276" w:lineRule="auto"/>
-      </w:pPr>
-      <w:r>
-        <w:rPr>
-          <w:b/>
-          <w:color w:val="024873"/>
-        </w:rPr>
-        <w:t xml:space="preserve">Dynamic 'Today at VBC' Session Engine: </w:t>
-      </w:r>
-      <w:r>
-        <w:t>Automatically calculates the day of the week and displays current game times, table fees ($8.00), and directions.</w:t>
-      </w:r>
-    </w:p>
-    <w:p>
-      <w:pPr>
-        <w:pStyle w:val="ListBullet"/>
-        <w:spacing w:before="40" w:after="80" w:line="276" w:lineRule="auto"/>
-      </w:pPr>
-      <w:r>
-        <w:rPr>
-          <w:b/>
-          <w:color w:val="024873"/>
-        </w:rPr>
-        <w:t xml:space="preserve">Interactive Game &amp; Event Calendar: </w:t>
-      </w:r>
-      <w:r>
-        <w:t>Filterable monthly calendar highlighting Open Pairs, Limited 0-750/0-1500, Swiss Teams, Mentored play, and District 20 STaC games.</w:t>
-      </w:r>
-    </w:p>
-    <w:p>
-      <w:pPr>
-        <w:pStyle w:val="ListBullet"/>
-        <w:spacing w:before="40" w:after="80" w:line="276" w:lineRule="auto"/>
-      </w:pPr>
-      <w:r>
-        <w:rPr>
-          <w:b/>
-          <w:color w:val="024873"/>
-        </w:rPr>
-        <w:t xml:space="preserve">Live Scores &amp; Masterpoint Hub: </w:t>
-      </w:r>
-      <w:r>
-        <w:t>Direct integration with ACBL Live (Sanction #118489), The Common Game, and Unit 452 Ace of Clubs &amp; Mini-McKenney race leaderboards.</w:t>
-      </w:r>
-    </w:p>
-    <w:p>
-      <w:pPr>
-        <w:pStyle w:val="ListBullet"/>
-        <w:spacing w:before="40" w:after="80" w:line="276" w:lineRule="auto"/>
-      </w:pPr>
-      <w:r>
-        <w:rPr>
-          <w:b/>
-          <w:color w:val="024873"/>
-        </w:rPr>
-        <w:t xml:space="preserve">Digital Partnership Desk: </w:t>
-      </w:r>
-      <w:r>
-        <w:t>Self-service matchmaking board allowing players to post and browse partner requests with local persistence.</w:t>
-      </w:r>
-    </w:p>
-    <w:p>
-      <w:pPr>
-        <w:pStyle w:val="ListBullet"/>
-        <w:spacing w:before="40" w:after="80" w:line="276" w:lineRule="auto"/>
-      </w:pPr>
-      <w:r>
-        <w:rPr>
-          <w:b/>
-          <w:color w:val="024873"/>
-        </w:rPr>
-        <w:t xml:space="preserve">Zero Recurring SaaS Software Fees: </w:t>
-      </w:r>
-      <w:r>
-        <w:t>Built with high-efficiency vanilla web architecture and hosted on high-availability cloud infrastructure with $0 monthly hosting costs.</w:t>
-      </w:r>
-    </w:p>
-    <w:p>
-      <w:pPr>
-        <w:spacing w:before="320" w:after="120"/>
-      </w:pPr>
-      <w:r>
-        <w:rPr>
-          <w:b/>
-          <w:color w:val="024873"/>
-          <w:sz w:val="28"/>
-        </w:rPr>
-        <w:t>2. Scope of Work &amp; Deliverables</w:t>
-      </w:r>
-    </w:p>
-    <w:p>
-      <w:pPr>
-        <w:spacing w:before="160" w:after="60"/>
-      </w:pPr>
       <w:r>
         <w:rPr>
           <w:b/>
           <w:color w:val="0477BF"/>
-          <w:sz w:val="23"/>
         </w:rPr>
-        <w:t>Phase 1: Brand Identity &amp; UI/UX Design System</w:t>
+        <w:t>https://highhandpro.github.io/Vancouver-Bridge-Club/index.html</w:t>
       </w:r>
     </w:p>
     <w:p>
@@ -353,7 +250,18 @@
         <w:spacing w:before="20" w:after="40" w:line="276" w:lineRule="auto"/>
       </w:pPr>
       <w:r>
-        <w:t>Custom brand color palette implementation (Deep Navy #024873, Rich Cerulean #0477BF, Sky Blue #2995D9, Soft Blue #77B3D9, Warm Sand #F2EDEB, Pure White &amp; Black).</w:t>
+        <w:rPr>
+          <w:rFonts w:ascii="Calibri" w:hAnsi="Calibri"/>
+          <w:b/>
+          <w:color w:val="024873"/>
+        </w:rPr>
+        <w:t xml:space="preserve">Complete 7-Page Multi-Page Suite: </w:t>
+      </w:r>
+      <w:r>
+        <w:rPr>
+          <w:rFonts w:ascii="Calibri" w:hAnsi="Calibri"/>
+        </w:rPr>
+        <w:t>Home Portal, Schedule &amp; Calendar, ACBL Results Hub, Digital Partnership Desk, Lessons &amp; Rules, Governance Archive, and Community Gallery.</w:t>
       </w:r>
     </w:p>
     <w:p>
@@ -362,7 +270,18 @@
         <w:spacing w:before="20" w:after="40" w:line="276" w:lineRule="auto"/>
       </w:pPr>
       <w:r>
-        <w:t>Integration and optimization of the official Vancouver Bridge Club bridge &amp; mountain emblem logo.</w:t>
+        <w:rPr>
+          <w:rFonts w:ascii="Calibri" w:hAnsi="Calibri"/>
+          <w:b/>
+          <w:color w:val="024873"/>
+        </w:rPr>
+        <w:t xml:space="preserve">Senior-Friendly Accessibility: </w:t>
+      </w:r>
+      <w:r>
+        <w:rPr>
+          <w:rFonts w:ascii="Calibri" w:hAnsi="Calibri"/>
+        </w:rPr>
+        <w:t>Built-in 1-click text scaling (A / A+ / A++) and high-contrast dark/light mode engine.</w:t>
       </w:r>
     </w:p>
     <w:p>
@@ -371,20 +290,18 @@
         <w:spacing w:before="20" w:after="40" w:line="276" w:lineRule="auto"/>
       </w:pPr>
       <w:r>
-        <w:t>Modern structured tab-strip navigation for smooth, intuitive browsing across all screen sizes.</w:t>
+        <w:rPr>
+          <w:rFonts w:ascii="Calibri" w:hAnsi="Calibri"/>
+          <w:b/>
+          <w:color w:val="024873"/>
+        </w:rPr>
+        <w:t xml:space="preserve">Custom Brand Identity: </w:t>
       </w:r>
-    </w:p>
-    <w:p>
-      <w:pPr>
-        <w:spacing w:before="160" w:after="60"/>
-      </w:pPr>
       <w:r>
         <w:rPr>
-          <w:b/>
-          <w:color w:val="0477BF"/>
-          <w:sz w:val="23"/>
+          <w:rFonts w:ascii="Calibri" w:hAnsi="Calibri"/>
         </w:rPr>
-        <w:t>Phase 2: Comprehensive Multi-Page Website Suite</w:t>
+        <w:t>Integrated official Vancouver Bridge Club bridge &amp; suits logo with tailored club palette (#024873 Navy, #0477BF Blue, #2995D9 Sky, #77B3D9, #F2EDEB).</w:t>
       </w:r>
     </w:p>
     <w:p>
@@ -393,171 +310,32 @@
         <w:spacing w:before="20" w:after="40" w:line="276" w:lineRule="auto"/>
       </w:pPr>
       <w:r>
-        <w:t>Home Portal (index.html): Hero showcase, dynamic 'Today at VBC' widget, weekly schedule summary table, location map, and direct contacts.</w:t>
+        <w:rPr>
+          <w:rFonts w:ascii="Calibri" w:hAnsi="Calibri"/>
+          <w:b/>
+          <w:color w:val="024873"/>
+        </w:rPr>
+        <w:t xml:space="preserve">Zero Recurring Software Fees: </w:t>
+      </w:r>
+      <w:r>
+        <w:rPr>
+          <w:rFonts w:ascii="Calibri" w:hAnsi="Calibri"/>
+        </w:rPr>
+        <w:t>100% custom-built with semantic web architecture—eliminating monthly subscriptions like Wix ($25–$45/mo).</w:t>
       </w:r>
     </w:p>
     <w:p>
       <w:pPr>
-        <w:pStyle w:val="ListBullet"/>
-        <w:spacing w:before="20" w:after="40" w:line="276" w:lineRule="auto"/>
-      </w:pPr>
-      <w:r>
-        <w:t>Game Schedule &amp; Calendar (schedule.html): Interactive monthly calendar, category filters (Open, Limited, Teams, Mentoring, STaC), table fee rules, and official PDF downloads.</w:t>
-      </w:r>
-    </w:p>
-    <w:p>
-      <w:pPr>
-        <w:pStyle w:val="ListBullet"/>
-        <w:spacing w:before="20" w:after="40" w:line="276" w:lineRule="auto"/>
-      </w:pPr>
-      <w:r>
-        <w:t>Scores &amp; Results Hub (results.html): ACBL Live integration, The Common Game access, Unit 452 masterpoint races, rank advancement recognitions, and masterpoint color guides.</w:t>
-      </w:r>
-    </w:p>
-    <w:p>
-      <w:pPr>
-        <w:pStyle w:val="ListBullet"/>
-        <w:spacing w:before="20" w:after="40" w:line="276" w:lineRule="auto"/>
-      </w:pPr>
-      <w:r>
-        <w:t>Digital Partnership Desk (partnership.html): Interactive bulletin board, filterable player search, request submission modal, and guaranteed standby host program info.</w:t>
-      </w:r>
-    </w:p>
-    <w:p>
-      <w:pPr>
-        <w:pStyle w:val="ListBullet"/>
-        <w:spacing w:before="20" w:after="40" w:line="276" w:lineRule="auto"/>
-      </w:pPr>
-      <w:r>
-        <w:t>Education Center &amp; Rules (learn.html): Lesson schedules, ACBL convention charts, alert procedures, duplicate laws, zero-tolerance conduct, and beginner tutorials.</w:t>
-      </w:r>
-    </w:p>
-    <w:p>
-      <w:pPr>
-        <w:pStyle w:val="ListBullet"/>
-        <w:spacing w:before="20" w:after="40" w:line="276" w:lineRule="auto"/>
-      </w:pPr>
-      <w:r>
-        <w:t>Unit 452 Governance (governance.html): Board of Directors directory, PDF board minutes archive, Unit bylaws, and disciplinary procedures.</w:t>
-      </w:r>
-    </w:p>
-    <w:p>
-      <w:pPr>
-        <w:pStyle w:val="ListBullet"/>
-        <w:spacing w:before="20" w:after="40" w:line="276" w:lineRule="auto"/>
-      </w:pPr>
-      <w:r>
-        <w:t>Community &amp; Heritage (community.html): Photo galleries, Gary Bowers bridge humor cartoons, In Memoriam memorials, and District 20 sister club directory.</w:t>
-      </w:r>
-    </w:p>
-    <w:p>
-      <w:pPr>
-        <w:spacing w:before="160" w:after="60"/>
+        <w:spacing w:before="280" w:after="80"/>
       </w:pPr>
       <w:r>
         <w:rPr>
-          <w:b/>
-          <w:color w:val="0477BF"/>
-          <w:sz w:val="23"/>
-        </w:rPr>
-        <w:t>Phase 3: Accessibility Engineering &amp; Performance</w:t>
-      </w:r>
-    </w:p>
-    <w:p>
-      <w:pPr>
-        <w:pStyle w:val="ListBullet"/>
-        <w:spacing w:before="20" w:after="40" w:line="276" w:lineRule="auto"/>
-      </w:pPr>
-      <w:r>
-        <w:t>Full compliance with senior web readability guidelines (AAA contrast ratios, high legibility typography).</w:t>
-      </w:r>
-    </w:p>
-    <w:p>
-      <w:pPr>
-        <w:pStyle w:val="ListBullet"/>
-        <w:spacing w:before="20" w:after="40" w:line="276" w:lineRule="auto"/>
-      </w:pPr>
-      <w:r>
-        <w:t>1-Click dynamic font-size toggling with instant browser memory.</w:t>
-      </w:r>
-    </w:p>
-    <w:p>
-      <w:pPr>
-        <w:pStyle w:val="ListBullet"/>
-        <w:spacing w:before="20" w:after="40" w:line="276" w:lineRule="auto"/>
-      </w:pPr>
-      <w:r>
-        <w:t>Full dark and light mode toggle system with custom color mappings.</w:t>
-      </w:r>
-    </w:p>
-    <w:p>
-      <w:pPr>
-        <w:pStyle w:val="ListBullet"/>
-        <w:spacing w:before="20" w:after="40" w:line="276" w:lineRule="auto"/>
-      </w:pPr>
-      <w:r>
-        <w:t>100% mobile and tablet responsive layouts tested across iOS, Android, macOS, and Windows.</w:t>
-      </w:r>
-    </w:p>
-    <w:p>
-      <w:pPr>
-        <w:spacing w:before="160" w:after="60"/>
-      </w:pPr>
-      <w:r>
-        <w:rPr>
-          <w:b/>
-          <w:color w:val="0477BF"/>
-          <w:sz w:val="23"/>
-        </w:rPr>
-        <w:t>Phase 4: Deployment, Domain Configuration &amp; Handover</w:t>
-      </w:r>
-    </w:p>
-    <w:p>
-      <w:pPr>
-        <w:pStyle w:val="ListBullet"/>
-        <w:spacing w:before="20" w:after="40" w:line="276" w:lineRule="auto"/>
-      </w:pPr>
-      <w:r>
-        <w:t>Production deployment to high-availability GitHub Pages cloud infrastructure (99.99% uptime).</w:t>
-      </w:r>
-    </w:p>
-    <w:p>
-      <w:pPr>
-        <w:pStyle w:val="ListBullet"/>
-        <w:spacing w:before="20" w:after="40" w:line="276" w:lineRule="auto"/>
-      </w:pPr>
-      <w:r>
-        <w:t>Custom domain connection (e.g., vancouverbridgeclub.org) with automated SSL security certificate.</w:t>
-      </w:r>
-    </w:p>
-    <w:p>
-      <w:pPr>
-        <w:pStyle w:val="ListBullet"/>
-        <w:spacing w:before="20" w:after="40" w:line="276" w:lineRule="auto"/>
-      </w:pPr>
-      <w:r>
-        <w:t>Client documentation and training for board members to update calendar files and board minutes.</w:t>
-      </w:r>
-    </w:p>
-    <w:p>
-      <w:pPr>
-        <w:spacing w:before="320" w:after="120"/>
-      </w:pPr>
-      <w:r>
-        <w:rPr>
+          <w:rFonts w:ascii="Calibri" w:hAnsi="Calibri"/>
           <w:b/>
           <w:color w:val="024873"/>
-          <w:sz w:val="28"/>
+          <w:sz w:val="26"/>
         </w:rPr>
-        <w:t>3. Itemized Project Cost Estimate</w:t>
-      </w:r>
-    </w:p>
-    <w:p>
-      <w:pPr>
-        <w:spacing w:after="160"/>
-      </w:pPr>
-      <w:r>
-        <w:t>Below is the transparent, fixed-price breakdown for all design, engineering, content structuring, testing, and deployment phases.</w:t>
+        <w:t>2. Cost Estimate &amp; Integration Breakdown</w:t>
       </w:r>
     </w:p>
     <w:tbl>
@@ -576,21 +354,20 @@
         </w:tblBorders>
       </w:tblPr>
       <w:tblGrid>
-        <w:gridCol w:w="2340"/>
-        <w:gridCol w:w="2340"/>
-        <w:gridCol w:w="2340"/>
-        <w:gridCol w:w="2340"/>
+        <w:gridCol w:w="3120"/>
+        <w:gridCol w:w="3120"/>
+        <w:gridCol w:w="3120"/>
       </w:tblGrid>
       <w:tr>
         <w:tc>
           <w:tcPr>
-            <w:tcW w:type="dxa" w:w="2592"/>
+            <w:tcW w:type="dxa" w:w="3168"/>
             <w:shd w:fill="024873"/>
             <w:tcMar>
-              <w:top w:w="120" w:type="dxa"/>
-              <w:bottom w:w="120" w:type="dxa"/>
-              <w:left w:w="120" w:type="dxa"/>
-              <w:right w:w="120" w:type="dxa"/>
+              <w:top w:w="100" w:type="dxa"/>
+              <w:bottom w:w="100" w:type="dxa"/>
+              <w:left w:w="100" w:type="dxa"/>
+              <w:right w:w="100" w:type="dxa"/>
             </w:tcMar>
           </w:tcPr>
           <w:p>
@@ -599,23 +376,24 @@
             </w:pPr>
             <w:r>
               <w:rPr>
+                <w:rFonts w:ascii="Calibri" w:hAnsi="Calibri"/>
                 <w:b/>
                 <w:color w:val="FFFFFF"/>
                 <w:sz w:val="19"/>
               </w:rPr>
-              <w:t>Deliverable Phase</w:t>
+              <w:t>Milestone / Phase</w:t>
             </w:r>
           </w:p>
         </w:tc>
         <w:tc>
           <w:tcPr>
-            <w:tcW w:type="dxa" w:w="4608"/>
+            <w:tcW w:type="dxa" w:w="4752"/>
             <w:shd w:fill="024873"/>
             <w:tcMar>
-              <w:top w:w="120" w:type="dxa"/>
-              <w:bottom w:w="120" w:type="dxa"/>
-              <w:left w:w="120" w:type="dxa"/>
-              <w:right w:w="120" w:type="dxa"/>
+              <w:top w:w="100" w:type="dxa"/>
+              <w:bottom w:w="100" w:type="dxa"/>
+              <w:left w:w="100" w:type="dxa"/>
+              <w:right w:w="100" w:type="dxa"/>
             </w:tcMar>
           </w:tcPr>
           <w:p>
@@ -624,23 +402,24 @@
             </w:pPr>
             <w:r>
               <w:rPr>
+                <w:rFonts w:ascii="Calibri" w:hAnsi="Calibri"/>
                 <w:b/>
                 <w:color w:val="FFFFFF"/>
                 <w:sz w:val="19"/>
               </w:rPr>
-              <w:t>Scope &amp; Inclusions</w:t>
+              <w:t>Description &amp; Inclusions</w:t>
             </w:r>
           </w:p>
         </w:tc>
         <w:tc>
           <w:tcPr>
-            <w:tcW w:type="dxa" w:w="1152"/>
+            <w:tcW w:type="dxa" w:w="1440"/>
             <w:shd w:fill="024873"/>
             <w:tcMar>
-              <w:top w:w="120" w:type="dxa"/>
-              <w:bottom w:w="120" w:type="dxa"/>
-              <w:left w:w="120" w:type="dxa"/>
-              <w:right w:w="120" w:type="dxa"/>
+              <w:top w:w="100" w:type="dxa"/>
+              <w:bottom w:w="100" w:type="dxa"/>
+              <w:left w:w="100" w:type="dxa"/>
+              <w:right w:w="100" w:type="dxa"/>
             </w:tcMar>
           </w:tcPr>
           <w:p>
@@ -649,23 +428,78 @@
             </w:pPr>
             <w:r>
               <w:rPr>
+                <w:rFonts w:ascii="Calibri" w:hAnsi="Calibri"/>
                 <w:b/>
                 <w:color w:val="FFFFFF"/>
                 <w:sz w:val="19"/>
               </w:rPr>
-              <w:t>Est. Hours</w:t>
+              <w:t>Cost</w:t>
+            </w:r>
+          </w:p>
+        </w:tc>
+      </w:tr>
+      <w:tr>
+        <w:tc>
+          <w:tcPr>
+            <w:tcW w:type="dxa" w:w="3168"/>
+            <w:shd w:fill="F2EDEB"/>
+            <w:tcMar>
+              <w:top w:w="90" w:type="dxa"/>
+              <w:bottom w:w="90" w:type="dxa"/>
+              <w:left w:w="100" w:type="dxa"/>
+              <w:right w:w="100" w:type="dxa"/>
+            </w:tcMar>
+          </w:tcPr>
+          <w:p>
+            <w:pPr>
+              <w:jc w:val="left"/>
+            </w:pPr>
+            <w:r>
+              <w:rPr>
+                <w:rFonts w:ascii="Calibri" w:hAnsi="Calibri"/>
+                <w:b/>
+                <w:color w:val="024873"/>
+                <w:sz w:val="19"/>
+              </w:rPr>
+              <w:t>Phase 1: Initial Overhaul &amp; Prototype (Completed)</w:t>
             </w:r>
           </w:p>
         </w:tc>
         <w:tc>
           <w:tcPr>
-            <w:tcW w:type="dxa" w:w="1296"/>
-            <w:shd w:fill="024873"/>
+            <w:tcW w:type="dxa" w:w="4752"/>
+            <w:shd w:fill="F2EDEB"/>
             <w:tcMar>
-              <w:top w:w="120" w:type="dxa"/>
-              <w:bottom w:w="120" w:type="dxa"/>
-              <w:left w:w="120" w:type="dxa"/>
-              <w:right w:w="120" w:type="dxa"/>
+              <w:top w:w="90" w:type="dxa"/>
+              <w:bottom w:w="90" w:type="dxa"/>
+              <w:left w:w="100" w:type="dxa"/>
+              <w:right w:w="100" w:type="dxa"/>
+            </w:tcMar>
+          </w:tcPr>
+          <w:p>
+            <w:pPr>
+              <w:jc w:val="left"/>
+            </w:pPr>
+            <w:r>
+              <w:rPr>
+                <w:rFonts w:ascii="Calibri" w:hAnsi="Calibri"/>
+                <w:b w:val="0"/>
+                <w:color w:val="0F172A"/>
+                <w:sz w:val="19"/>
+              </w:rPr>
+              <w:t>Full architectural overhaul, 7-page suite, navigation tab strip, accessibility engine, logo &amp; palette integration.</w:t>
+            </w:r>
+          </w:p>
+        </w:tc>
+        <w:tc>
+          <w:tcPr>
+            <w:tcW w:type="dxa" w:w="1440"/>
+            <w:shd w:fill="F2EDEB"/>
+            <w:tcMar>
+              <w:top w:w="90" w:type="dxa"/>
+              <w:bottom w:w="90" w:type="dxa"/>
+              <w:left w:w="100" w:type="dxa"/>
+              <w:right w:w="100" w:type="dxa"/>
             </w:tcMar>
           </w:tcPr>
           <w:p>
@@ -674,516 +508,7 @@
             </w:pPr>
             <w:r>
               <w:rPr>
-                <w:b/>
-                <w:color w:val="FFFFFF"/>
-                <w:sz w:val="19"/>
-              </w:rPr>
-              <w:t>Fixed Cost</w:t>
-            </w:r>
-          </w:p>
-        </w:tc>
-      </w:tr>
-      <w:tr>
-        <w:tc>
-          <w:tcPr>
-            <w:tcW w:type="dxa" w:w="2592"/>
-            <w:shd w:fill="F2EDEB"/>
-            <w:tcMar>
-              <w:top w:w="100" w:type="dxa"/>
-              <w:bottom w:w="100" w:type="dxa"/>
-              <w:left w:w="120" w:type="dxa"/>
-              <w:right w:w="120" w:type="dxa"/>
-            </w:tcMar>
-          </w:tcPr>
-          <w:p>
-            <w:pPr>
-              <w:jc w:val="left"/>
-            </w:pPr>
-            <w:r>
-              <w:rPr>
-                <w:b/>
-                <w:color w:val="024873"/>
-                <w:sz w:val="19"/>
-              </w:rPr>
-              <w:t>Phase 1: Architecture &amp; Design</w:t>
-            </w:r>
-          </w:p>
-        </w:tc>
-        <w:tc>
-          <w:tcPr>
-            <w:tcW w:type="dxa" w:w="4608"/>
-            <w:shd w:fill="F2EDEB"/>
-            <w:tcMar>
-              <w:top w:w="100" w:type="dxa"/>
-              <w:bottom w:w="100" w:type="dxa"/>
-              <w:left w:w="120" w:type="dxa"/>
-              <w:right w:w="120" w:type="dxa"/>
-            </w:tcMar>
-          </w:tcPr>
-          <w:p>
-            <w:pPr>
-              <w:jc w:val="left"/>
-            </w:pPr>
-            <w:r>
-              <w:rPr>
-                <w:b w:val="0"/>
-                <w:color w:val="0F172A"/>
-                <w:sz w:val="19"/>
-              </w:rPr>
-              <w:t>Custom palette design system, logo optimization, brand tab-navigation framework</w:t>
-            </w:r>
-          </w:p>
-        </w:tc>
-        <w:tc>
-          <w:tcPr>
-            <w:tcW w:type="dxa" w:w="1152"/>
-            <w:shd w:fill="F2EDEB"/>
-            <w:tcMar>
-              <w:top w:w="100" w:type="dxa"/>
-              <w:bottom w:w="100" w:type="dxa"/>
-              <w:left w:w="120" w:type="dxa"/>
-              <w:right w:w="120" w:type="dxa"/>
-            </w:tcMar>
-          </w:tcPr>
-          <w:p>
-            <w:pPr>
-              <w:jc w:val="right"/>
-            </w:pPr>
-            <w:r>
-              <w:rPr>
-                <w:b w:val="0"/>
-                <w:color w:val="0F172A"/>
-                <w:sz w:val="19"/>
-              </w:rPr>
-              <w:t>10 hrs</w:t>
-            </w:r>
-          </w:p>
-        </w:tc>
-        <w:tc>
-          <w:tcPr>
-            <w:tcW w:type="dxa" w:w="1296"/>
-            <w:shd w:fill="F2EDEB"/>
-            <w:tcMar>
-              <w:top w:w="100" w:type="dxa"/>
-              <w:bottom w:w="100" w:type="dxa"/>
-              <w:left w:w="120" w:type="dxa"/>
-              <w:right w:w="120" w:type="dxa"/>
-            </w:tcMar>
-          </w:tcPr>
-          <w:p>
-            <w:pPr>
-              <w:jc w:val="right"/>
-            </w:pPr>
-            <w:r>
-              <w:rPr>
-                <w:b w:val="0"/>
-                <w:color w:val="0F172A"/>
-                <w:sz w:val="19"/>
-              </w:rPr>
-              <w:t>$750.00</w:t>
-            </w:r>
-          </w:p>
-        </w:tc>
-      </w:tr>
-      <w:tr>
-        <w:tc>
-          <w:tcPr>
-            <w:tcW w:type="dxa" w:w="2592"/>
-            <w:shd w:fill="FFFFFF"/>
-            <w:tcMar>
-              <w:top w:w="100" w:type="dxa"/>
-              <w:bottom w:w="100" w:type="dxa"/>
-              <w:left w:w="120" w:type="dxa"/>
-              <w:right w:w="120" w:type="dxa"/>
-            </w:tcMar>
-          </w:tcPr>
-          <w:p>
-            <w:pPr>
-              <w:jc w:val="left"/>
-            </w:pPr>
-            <w:r>
-              <w:rPr>
-                <w:b/>
-                <w:color w:val="024873"/>
-                <w:sz w:val="19"/>
-              </w:rPr>
-              <w:t>Phase 2: Core Web Platform Suite</w:t>
-            </w:r>
-          </w:p>
-        </w:tc>
-        <w:tc>
-          <w:tcPr>
-            <w:tcW w:type="dxa" w:w="4608"/>
-            <w:shd w:fill="FFFFFF"/>
-            <w:tcMar>
-              <w:top w:w="100" w:type="dxa"/>
-              <w:bottom w:w="100" w:type="dxa"/>
-              <w:left w:w="120" w:type="dxa"/>
-              <w:right w:w="120" w:type="dxa"/>
-            </w:tcMar>
-          </w:tcPr>
-          <w:p>
-            <w:pPr>
-              <w:jc w:val="left"/>
-            </w:pPr>
-            <w:r>
-              <w:rPr>
-                <w:b w:val="0"/>
-                <w:color w:val="0F172A"/>
-                <w:sz w:val="19"/>
-              </w:rPr>
-              <w:t>7 Complete Pages: Home, Schedule, Results, Partnership, Learn, Governance, Community</w:t>
-            </w:r>
-          </w:p>
-        </w:tc>
-        <w:tc>
-          <w:tcPr>
-            <w:tcW w:type="dxa" w:w="1152"/>
-            <w:shd w:fill="FFFFFF"/>
-            <w:tcMar>
-              <w:top w:w="100" w:type="dxa"/>
-              <w:bottom w:w="100" w:type="dxa"/>
-              <w:left w:w="120" w:type="dxa"/>
-              <w:right w:w="120" w:type="dxa"/>
-            </w:tcMar>
-          </w:tcPr>
-          <w:p>
-            <w:pPr>
-              <w:jc w:val="right"/>
-            </w:pPr>
-            <w:r>
-              <w:rPr>
-                <w:b w:val="0"/>
-                <w:color w:val="0F172A"/>
-                <w:sz w:val="19"/>
-              </w:rPr>
-              <w:t>22 hrs</w:t>
-            </w:r>
-          </w:p>
-        </w:tc>
-        <w:tc>
-          <w:tcPr>
-            <w:tcW w:type="dxa" w:w="1296"/>
-            <w:shd w:fill="FFFFFF"/>
-            <w:tcMar>
-              <w:top w:w="100" w:type="dxa"/>
-              <w:bottom w:w="100" w:type="dxa"/>
-              <w:left w:w="120" w:type="dxa"/>
-              <w:right w:w="120" w:type="dxa"/>
-            </w:tcMar>
-          </w:tcPr>
-          <w:p>
-            <w:pPr>
-              <w:jc w:val="right"/>
-            </w:pPr>
-            <w:r>
-              <w:rPr>
-                <w:b w:val="0"/>
-                <w:color w:val="0F172A"/>
-                <w:sz w:val="19"/>
-              </w:rPr>
-              <w:t>$1,650.00</w:t>
-            </w:r>
-          </w:p>
-        </w:tc>
-      </w:tr>
-      <w:tr>
-        <w:tc>
-          <w:tcPr>
-            <w:tcW w:type="dxa" w:w="2592"/>
-            <w:shd w:fill="F2EDEB"/>
-            <w:tcMar>
-              <w:top w:w="100" w:type="dxa"/>
-              <w:bottom w:w="100" w:type="dxa"/>
-              <w:left w:w="120" w:type="dxa"/>
-              <w:right w:w="120" w:type="dxa"/>
-            </w:tcMar>
-          </w:tcPr>
-          <w:p>
-            <w:pPr>
-              <w:jc w:val="left"/>
-            </w:pPr>
-            <w:r>
-              <w:rPr>
-                <w:b/>
-                <w:color w:val="024873"/>
-                <w:sz w:val="19"/>
-              </w:rPr>
-              <w:t>Phase 3: Dynamic Widgets &amp; Logic</w:t>
-            </w:r>
-          </w:p>
-        </w:tc>
-        <w:tc>
-          <w:tcPr>
-            <w:tcW w:type="dxa" w:w="4608"/>
-            <w:shd w:fill="F2EDEB"/>
-            <w:tcMar>
-              <w:top w:w="100" w:type="dxa"/>
-              <w:bottom w:w="100" w:type="dxa"/>
-              <w:left w:w="120" w:type="dxa"/>
-              <w:right w:w="120" w:type="dxa"/>
-            </w:tcMar>
-          </w:tcPr>
-          <w:p>
-            <w:pPr>
-              <w:jc w:val="left"/>
-            </w:pPr>
-            <w:r>
-              <w:rPr>
-                <w:b w:val="0"/>
-                <w:color w:val="0F172A"/>
-                <w:sz w:val="19"/>
-              </w:rPr>
-              <w:t>Dynamic 'Today at VBC' calculator, live ACBL/Common Game feeds, interactive bulletin board</w:t>
-            </w:r>
-          </w:p>
-        </w:tc>
-        <w:tc>
-          <w:tcPr>
-            <w:tcW w:type="dxa" w:w="1152"/>
-            <w:shd w:fill="F2EDEB"/>
-            <w:tcMar>
-              <w:top w:w="100" w:type="dxa"/>
-              <w:bottom w:w="100" w:type="dxa"/>
-              <w:left w:w="120" w:type="dxa"/>
-              <w:right w:w="120" w:type="dxa"/>
-            </w:tcMar>
-          </w:tcPr>
-          <w:p>
-            <w:pPr>
-              <w:jc w:val="right"/>
-            </w:pPr>
-            <w:r>
-              <w:rPr>
-                <w:b w:val="0"/>
-                <w:color w:val="0F172A"/>
-                <w:sz w:val="19"/>
-              </w:rPr>
-              <w:t>10 hrs</w:t>
-            </w:r>
-          </w:p>
-        </w:tc>
-        <w:tc>
-          <w:tcPr>
-            <w:tcW w:type="dxa" w:w="1296"/>
-            <w:shd w:fill="F2EDEB"/>
-            <w:tcMar>
-              <w:top w:w="100" w:type="dxa"/>
-              <w:bottom w:w="100" w:type="dxa"/>
-              <w:left w:w="120" w:type="dxa"/>
-              <w:right w:w="120" w:type="dxa"/>
-            </w:tcMar>
-          </w:tcPr>
-          <w:p>
-            <w:pPr>
-              <w:jc w:val="right"/>
-            </w:pPr>
-            <w:r>
-              <w:rPr>
-                <w:b w:val="0"/>
-                <w:color w:val="0F172A"/>
-                <w:sz w:val="19"/>
-              </w:rPr>
-              <w:t>$750.00</w:t>
-            </w:r>
-          </w:p>
-        </w:tc>
-      </w:tr>
-      <w:tr>
-        <w:tc>
-          <w:tcPr>
-            <w:tcW w:type="dxa" w:w="2592"/>
-            <w:shd w:fill="FFFFFF"/>
-            <w:tcMar>
-              <w:top w:w="100" w:type="dxa"/>
-              <w:bottom w:w="100" w:type="dxa"/>
-              <w:left w:w="120" w:type="dxa"/>
-              <w:right w:w="120" w:type="dxa"/>
-            </w:tcMar>
-          </w:tcPr>
-          <w:p>
-            <w:pPr>
-              <w:jc w:val="left"/>
-            </w:pPr>
-            <w:r>
-              <w:rPr>
-                <w:b/>
-                <w:color w:val="024873"/>
-                <w:sz w:val="19"/>
-              </w:rPr>
-              <w:t>Phase 4: Senior Accessibility Suite</w:t>
-            </w:r>
-          </w:p>
-        </w:tc>
-        <w:tc>
-          <w:tcPr>
-            <w:tcW w:type="dxa" w:w="4608"/>
-            <w:shd w:fill="FFFFFF"/>
-            <w:tcMar>
-              <w:top w:w="100" w:type="dxa"/>
-              <w:bottom w:w="100" w:type="dxa"/>
-              <w:left w:w="120" w:type="dxa"/>
-              <w:right w:w="120" w:type="dxa"/>
-            </w:tcMar>
-          </w:tcPr>
-          <w:p>
-            <w:pPr>
-              <w:jc w:val="left"/>
-            </w:pPr>
-            <w:r>
-              <w:rPr>
-                <w:b w:val="0"/>
-                <w:color w:val="0F172A"/>
-                <w:sz w:val="19"/>
-              </w:rPr>
-              <w:t>1-Click text scaling engine (A/A+/A++), light/dark mode system, cross-device testing</w:t>
-            </w:r>
-          </w:p>
-        </w:tc>
-        <w:tc>
-          <w:tcPr>
-            <w:tcW w:type="dxa" w:w="1152"/>
-            <w:shd w:fill="FFFFFF"/>
-            <w:tcMar>
-              <w:top w:w="100" w:type="dxa"/>
-              <w:bottom w:w="100" w:type="dxa"/>
-              <w:left w:w="120" w:type="dxa"/>
-              <w:right w:w="120" w:type="dxa"/>
-            </w:tcMar>
-          </w:tcPr>
-          <w:p>
-            <w:pPr>
-              <w:jc w:val="right"/>
-            </w:pPr>
-            <w:r>
-              <w:rPr>
-                <w:b w:val="0"/>
-                <w:color w:val="0F172A"/>
-                <w:sz w:val="19"/>
-              </w:rPr>
-              <w:t>6 hrs</w:t>
-            </w:r>
-          </w:p>
-        </w:tc>
-        <w:tc>
-          <w:tcPr>
-            <w:tcW w:type="dxa" w:w="1296"/>
-            <w:shd w:fill="FFFFFF"/>
-            <w:tcMar>
-              <w:top w:w="100" w:type="dxa"/>
-              <w:bottom w:w="100" w:type="dxa"/>
-              <w:left w:w="120" w:type="dxa"/>
-              <w:right w:w="120" w:type="dxa"/>
-            </w:tcMar>
-          </w:tcPr>
-          <w:p>
-            <w:pPr>
-              <w:jc w:val="right"/>
-            </w:pPr>
-            <w:r>
-              <w:rPr>
-                <w:b w:val="0"/>
-                <w:color w:val="0F172A"/>
-                <w:sz w:val="19"/>
-              </w:rPr>
-              <w:t>$450.00</w:t>
-            </w:r>
-          </w:p>
-        </w:tc>
-      </w:tr>
-      <w:tr>
-        <w:tc>
-          <w:tcPr>
-            <w:tcW w:type="dxa" w:w="2592"/>
-            <w:shd w:fill="F2EDEB"/>
-            <w:tcMar>
-              <w:top w:w="100" w:type="dxa"/>
-              <w:bottom w:w="100" w:type="dxa"/>
-              <w:left w:w="120" w:type="dxa"/>
-              <w:right w:w="120" w:type="dxa"/>
-            </w:tcMar>
-          </w:tcPr>
-          <w:p>
-            <w:pPr>
-              <w:jc w:val="left"/>
-            </w:pPr>
-            <w:r>
-              <w:rPr>
-                <w:b/>
-                <w:color w:val="024873"/>
-                <w:sz w:val="19"/>
-              </w:rPr>
-              <w:t>Phase 5: Cloud Deployment &amp; DNS</w:t>
-            </w:r>
-          </w:p>
-        </w:tc>
-        <w:tc>
-          <w:tcPr>
-            <w:tcW w:type="dxa" w:w="4608"/>
-            <w:shd w:fill="F2EDEB"/>
-            <w:tcMar>
-              <w:top w:w="100" w:type="dxa"/>
-              <w:bottom w:w="100" w:type="dxa"/>
-              <w:left w:w="120" w:type="dxa"/>
-              <w:right w:w="120" w:type="dxa"/>
-            </w:tcMar>
-          </w:tcPr>
-          <w:p>
-            <w:pPr>
-              <w:jc w:val="left"/>
-            </w:pPr>
-            <w:r>
-              <w:rPr>
-                <w:b w:val="0"/>
-                <w:color w:val="0F172A"/>
-                <w:sz w:val="19"/>
-              </w:rPr>
-              <w:t>GitHub Pages deployment, custom domain &amp; SSL setup, SEO optimization, board handover</w:t>
-            </w:r>
-          </w:p>
-        </w:tc>
-        <w:tc>
-          <w:tcPr>
-            <w:tcW w:type="dxa" w:w="1152"/>
-            <w:shd w:fill="F2EDEB"/>
-            <w:tcMar>
-              <w:top w:w="100" w:type="dxa"/>
-              <w:bottom w:w="100" w:type="dxa"/>
-              <w:left w:w="120" w:type="dxa"/>
-              <w:right w:w="120" w:type="dxa"/>
-            </w:tcMar>
-          </w:tcPr>
-          <w:p>
-            <w:pPr>
-              <w:jc w:val="right"/>
-            </w:pPr>
-            <w:r>
-              <w:rPr>
-                <w:b w:val="0"/>
-                <w:color w:val="0F172A"/>
-                <w:sz w:val="19"/>
-              </w:rPr>
-              <w:t>4 hrs</w:t>
-            </w:r>
-          </w:p>
-        </w:tc>
-        <w:tc>
-          <w:tcPr>
-            <w:tcW w:type="dxa" w:w="1296"/>
-            <w:shd w:fill="F2EDEB"/>
-            <w:tcMar>
-              <w:top w:w="100" w:type="dxa"/>
-              <w:bottom w:w="100" w:type="dxa"/>
-              <w:left w:w="120" w:type="dxa"/>
-              <w:right w:w="120" w:type="dxa"/>
-            </w:tcMar>
-          </w:tcPr>
-          <w:p>
-            <w:pPr>
-              <w:jc w:val="right"/>
-            </w:pPr>
-            <w:r>
-              <w:rPr>
+                <w:rFonts w:ascii="Calibri" w:hAnsi="Calibri"/>
                 <w:b w:val="0"/>
                 <w:color w:val="0F172A"/>
                 <w:sz w:val="19"/>
@@ -1196,13 +521,13 @@
       <w:tr>
         <w:tc>
           <w:tcPr>
-            <w:tcW w:type="dxa" w:w="2592"/>
-            <w:shd w:fill="0477BF"/>
+            <w:tcW w:type="dxa" w:w="3168"/>
+            <w:shd w:fill="FFFFFF"/>
             <w:tcMar>
-              <w:top w:w="100" w:type="dxa"/>
-              <w:bottom w:w="100" w:type="dxa"/>
-              <w:left w:w="120" w:type="dxa"/>
-              <w:right w:w="120" w:type="dxa"/>
+              <w:top w:w="90" w:type="dxa"/>
+              <w:bottom w:w="90" w:type="dxa"/>
+              <w:left w:w="100" w:type="dxa"/>
+              <w:right w:w="100" w:type="dxa"/>
             </w:tcMar>
           </w:tcPr>
           <w:p>
@@ -1211,6 +536,87 @@
             </w:pPr>
             <w:r>
               <w:rPr>
+                <w:rFonts w:ascii="Calibri" w:hAnsi="Calibri"/>
+                <w:b/>
+                <w:color w:val="024873"/>
+                <w:sz w:val="19"/>
+              </w:rPr>
+              <w:t>Phase 2: Total Integration &amp; Launch (Scope)</w:t>
+            </w:r>
+          </w:p>
+        </w:tc>
+        <w:tc>
+          <w:tcPr>
+            <w:tcW w:type="dxa" w:w="4752"/>
+            <w:shd w:fill="FFFFFF"/>
+            <w:tcMar>
+              <w:top w:w="90" w:type="dxa"/>
+              <w:bottom w:w="90" w:type="dxa"/>
+              <w:left w:w="100" w:type="dxa"/>
+              <w:right w:w="100" w:type="dxa"/>
+            </w:tcMar>
+          </w:tcPr>
+          <w:p>
+            <w:pPr>
+              <w:jc w:val="left"/>
+            </w:pPr>
+            <w:r>
+              <w:rPr>
+                <w:rFonts w:ascii="Calibri" w:hAnsi="Calibri"/>
+                <w:b w:val="0"/>
+                <w:color w:val="0F172A"/>
+                <w:sz w:val="19"/>
+              </w:rPr>
+              <w:t>Live ACBL &amp; Common Game links, board minutes archive integration, custom domain/DNS setup, SSL certificate, final content verification &amp; board handover.</w:t>
+            </w:r>
+          </w:p>
+        </w:tc>
+        <w:tc>
+          <w:tcPr>
+            <w:tcW w:type="dxa" w:w="1440"/>
+            <w:shd w:fill="FFFFFF"/>
+            <w:tcMar>
+              <w:top w:w="90" w:type="dxa"/>
+              <w:bottom w:w="90" w:type="dxa"/>
+              <w:left w:w="100" w:type="dxa"/>
+              <w:right w:w="100" w:type="dxa"/>
+            </w:tcMar>
+          </w:tcPr>
+          <w:p>
+            <w:pPr>
+              <w:jc w:val="right"/>
+            </w:pPr>
+            <w:r>
+              <w:rPr>
+                <w:rFonts w:ascii="Calibri" w:hAnsi="Calibri"/>
+                <w:b w:val="0"/>
+                <w:color w:val="0F172A"/>
+                <w:sz w:val="19"/>
+              </w:rPr>
+              <w:t>$400.00 – $700.00</w:t>
+            </w:r>
+          </w:p>
+        </w:tc>
+      </w:tr>
+      <w:tr>
+        <w:tc>
+          <w:tcPr>
+            <w:tcW w:type="dxa" w:w="3168"/>
+            <w:shd w:fill="0477BF"/>
+            <w:tcMar>
+              <w:top w:w="90" w:type="dxa"/>
+              <w:bottom w:w="90" w:type="dxa"/>
+              <w:left w:w="100" w:type="dxa"/>
+              <w:right w:w="100" w:type="dxa"/>
+            </w:tcMar>
+          </w:tcPr>
+          <w:p>
+            <w:pPr>
+              <w:jc w:val="left"/>
+            </w:pPr>
+            <w:r>
+              <w:rPr>
+                <w:rFonts w:ascii="Calibri" w:hAnsi="Calibri"/>
                 <w:b/>
                 <w:color w:val="FFFFFF"/>
                 <w:sz w:val="20"/>
@@ -1221,13 +627,13 @@
         </w:tc>
         <w:tc>
           <w:tcPr>
-            <w:tcW w:type="dxa" w:w="4608"/>
+            <w:tcW w:type="dxa" w:w="4752"/>
             <w:shd w:fill="0477BF"/>
             <w:tcMar>
-              <w:top w:w="100" w:type="dxa"/>
-              <w:bottom w:w="100" w:type="dxa"/>
-              <w:left w:w="120" w:type="dxa"/>
-              <w:right w:w="120" w:type="dxa"/>
+              <w:top w:w="90" w:type="dxa"/>
+              <w:bottom w:w="90" w:type="dxa"/>
+              <w:left w:w="100" w:type="dxa"/>
+              <w:right w:w="100" w:type="dxa"/>
             </w:tcMar>
           </w:tcPr>
           <w:p>
@@ -1236,23 +642,24 @@
             </w:pPr>
             <w:r>
               <w:rPr>
+                <w:rFonts w:ascii="Calibri" w:hAnsi="Calibri"/>
                 <w:b/>
                 <w:color w:val="FFFFFF"/>
                 <w:sz w:val="20"/>
               </w:rPr>
-              <w:t>Complete Turnkey Platform Delivery (Zero monthly software license fees)</w:t>
+              <w:t>Complete Turnkey Platform Delivery (Operating with $0 monthly hosting software fees)</w:t>
             </w:r>
           </w:p>
         </w:tc>
         <w:tc>
           <w:tcPr>
-            <w:tcW w:type="dxa" w:w="1152"/>
+            <w:tcW w:type="dxa" w:w="1440"/>
             <w:shd w:fill="0477BF"/>
             <w:tcMar>
-              <w:top w:w="100" w:type="dxa"/>
-              <w:bottom w:w="100" w:type="dxa"/>
-              <w:left w:w="120" w:type="dxa"/>
-              <w:right w:w="120" w:type="dxa"/>
+              <w:top w:w="90" w:type="dxa"/>
+              <w:bottom w:w="90" w:type="dxa"/>
+              <w:left w:w="100" w:type="dxa"/>
+              <w:right w:w="100" w:type="dxa"/>
             </w:tcMar>
           </w:tcPr>
           <w:p>
@@ -1261,36 +668,12 @@
             </w:pPr>
             <w:r>
               <w:rPr>
+                <w:rFonts w:ascii="Calibri" w:hAnsi="Calibri"/>
                 <w:b/>
                 <w:color w:val="FFFFFF"/>
                 <w:sz w:val="20"/>
               </w:rPr>
-              <w:t>52 hrs</w:t>
-            </w:r>
-          </w:p>
-        </w:tc>
-        <w:tc>
-          <w:tcPr>
-            <w:tcW w:type="dxa" w:w="1296"/>
-            <w:shd w:fill="0477BF"/>
-            <w:tcMar>
-              <w:top w:w="100" w:type="dxa"/>
-              <w:bottom w:w="100" w:type="dxa"/>
-              <w:left w:w="120" w:type="dxa"/>
-              <w:right w:w="120" w:type="dxa"/>
-            </w:tcMar>
-          </w:tcPr>
-          <w:p>
-            <w:pPr>
-              <w:jc w:val="right"/>
-            </w:pPr>
-            <w:r>
-              <w:rPr>
-                <w:b/>
-                <w:color w:val="FFFFFF"/>
-                <w:sz w:val="20"/>
-              </w:rPr>
-              <w:t>$3,900.00</w:t>
+              <w:t>$700.00 – $1,000.00</w:t>
             </w:r>
           </w:p>
         </w:tc>
@@ -1298,7 +681,7 @@
     </w:tbl>
     <w:p>
       <w:pPr>
-        <w:spacing w:after="200"/>
+        <w:spacing w:after="160"/>
       </w:pPr>
     </w:p>
     <w:tbl>
@@ -1324,10 +707,10 @@
             <w:tcW w:type="dxa" w:w="9360"/>
             <w:shd w:fill="F2EDEB"/>
             <w:tcMar>
-              <w:top w:w="140" w:type="dxa"/>
-              <w:bottom w:w="140" w:type="dxa"/>
-              <w:left w:w="160" w:type="dxa"/>
-              <w:right w:w="160" w:type="dxa"/>
+              <w:top w:w="100" w:type="dxa"/>
+              <w:bottom w:w="100" w:type="dxa"/>
+              <w:left w:w="140" w:type="dxa"/>
+              <w:right w:w="140" w:type="dxa"/>
             </w:tcMar>
           </w:tcPr>
           <w:p>
@@ -1336,19 +719,21 @@
             </w:pPr>
             <w:r>
               <w:rPr>
+                <w:rFonts w:ascii="Calibri" w:hAnsi="Calibri"/>
                 <w:b/>
                 <w:color w:val="024873"/>
-                <w:sz w:val="21"/>
+                <w:sz w:val="20"/>
               </w:rPr>
-              <w:t>COST SAVINGS HIGHLIGHT: $0 Ongoing Platform Software Fees</w:t>
+              <w:t>ANNUAL SAVINGS BENEFIT FOR UNIT 452:</w:t>
               <w:br/>
             </w:r>
             <w:r>
               <w:rPr>
+                <w:rFonts w:ascii="Calibri" w:hAnsi="Calibri"/>
                 <w:color w:val="0F172A"/>
                 <w:sz w:val="19"/>
               </w:rPr>
-              <w:t>Unlike commercial website builders (Wix, Squarespace, WordPress.com) which require recurring monthly subscriptions of $20–$45/month ($240–$540/year), this codebase is custom-built with standard semantic web technology. It operates with $0 in recurring platform or hosting fees, saving the Vancouver Bridge Club thousands of dollars over its lifespan.</w:t>
+              <w:t>Commercial website builders charge ongoing fees of $240–$540 every year. Because this platform is custom-built and deployed to high-performance cloud hosting, it operates with $0 in monthly software or builder subscriptions.</w:t>
             </w:r>
           </w:p>
         </w:tc>
@@ -1356,169 +741,86 @@
     </w:tbl>
     <w:p>
       <w:pPr>
-        <w:spacing w:before="320" w:after="120"/>
+        <w:spacing w:before="240" w:after="80"/>
       </w:pPr>
       <w:r>
         <w:rPr>
+          <w:rFonts w:ascii="Calibri" w:hAnsi="Calibri"/>
           <w:b/>
           <w:color w:val="024873"/>
-          <w:sz w:val="28"/>
+          <w:sz w:val="26"/>
         </w:rPr>
-        <w:t>4. Optional Maintenance &amp; Webmaster Support</w:t>
+        <w:t>3. Optional Webmaster Maintenance</w:t>
       </w:r>
     </w:p>
     <w:p>
       <w:pPr>
-        <w:spacing w:after="160" w:line="276" w:lineRule="auto"/>
+        <w:spacing w:after="80" w:line="276" w:lineRule="auto"/>
       </w:pPr>
       <w:r>
-        <w:t>While the board will be empowered with instructions to update content directly, the club may optionally retain Timothy Hufler for ongoing webmaster duties, monthly calendar uploads, tournament flyer publishing, and technical maintenance:</w:t>
+        <w:t>Following launch, the board can update files directly, or optionally retain Timothy Hufler for ongoing webmaster updates:</w:t>
       </w:r>
     </w:p>
     <w:p>
       <w:pPr>
         <w:pStyle w:val="ListBullet"/>
-        <w:spacing w:before="40" w:after="80" w:line="276" w:lineRule="auto"/>
+        <w:spacing w:before="20" w:after="40" w:line="276" w:lineRule="auto"/>
       </w:pPr>
       <w:r>
         <w:rPr>
+          <w:rFonts w:ascii="Calibri" w:hAnsi="Calibri"/>
           <w:b/>
           <w:color w:val="024873"/>
         </w:rPr>
-        <w:t xml:space="preserve">Monthly Retainer Option ($75 / month): </w:t>
+        <w:t xml:space="preserve">Monthly Retainer ($50 - $75 / mo): </w:t>
       </w:r>
       <w:r>
-        <w:t>Includes up to 2 hours of monthly updates (monthly calendar PDF uploads, board meeting minutes postings, officer updates, special event announcements, and technical support).</w:t>
+        <w:rPr>
+          <w:rFonts w:ascii="Calibri" w:hAnsi="Calibri"/>
+        </w:rPr>
+        <w:t>Includes regular monthly calendar uploads, tournament flyer postings, board minutes archiving, and technical support.</w:t>
       </w:r>
     </w:p>
     <w:p>
       <w:pPr>
         <w:pStyle w:val="ListBullet"/>
-        <w:spacing w:before="40" w:after="80" w:line="276" w:lineRule="auto"/>
+        <w:spacing w:before="20" w:after="40" w:line="276" w:lineRule="auto"/>
       </w:pPr>
       <w:r>
         <w:rPr>
+          <w:rFonts w:ascii="Calibri" w:hAnsi="Calibri"/>
           <w:b/>
           <w:color w:val="024873"/>
         </w:rPr>
-        <w:t xml:space="preserve">Annual Maintenance Package ($750 / year — Save $150): </w:t>
+        <w:t xml:space="preserve">Ad-Hoc Hourly Support ($40 / hr): </w:t>
       </w:r>
       <w:r>
-        <w:t>Full-year webmaster support and priority updates for all 12 monthly cycles plus annual board election updates.</w:t>
+        <w:rPr>
+          <w:rFonts w:ascii="Calibri" w:hAnsi="Calibri"/>
+        </w:rPr>
+        <w:t>On-demand support for occasional updates or new feature requests.</w:t>
       </w:r>
     </w:p>
     <w:p>
       <w:pPr>
-        <w:pStyle w:val="ListBullet"/>
-        <w:spacing w:before="40" w:after="80" w:line="276" w:lineRule="auto"/>
+        <w:spacing w:before="280" w:after="80"/>
       </w:pPr>
       <w:r>
         <w:rPr>
+          <w:rFonts w:ascii="Calibri" w:hAnsi="Calibri"/>
           <w:b/>
           <w:color w:val="024873"/>
+          <w:sz w:val="26"/>
         </w:rPr>
-        <w:t xml:space="preserve">Ad-Hoc Hourly Support ($50 / hour): </w:t>
-      </w:r>
-      <w:r>
-        <w:t>Available on-demand for special projects, tournament microsites, or major new features.</w:t>
+        <w:t>4. Approval &amp; Authorization</w:t>
       </w:r>
     </w:p>
     <w:p>
       <w:pPr>
-        <w:spacing w:before="320" w:after="120"/>
+        <w:spacing w:after="200"/>
       </w:pPr>
       <w:r>
-        <w:rPr>
-          <w:b/>
-          <w:color w:val="024873"/>
-          <w:sz w:val="28"/>
-        </w:rPr>
-        <w:t>5. Project Timeline &amp; Delivery Milestones</w:t>
-      </w:r>
-    </w:p>
-    <w:p>
-      <w:pPr>
-        <w:pStyle w:val="ListBullet"/>
-        <w:spacing w:before="40" w:after="80" w:line="276" w:lineRule="auto"/>
-      </w:pPr>
-      <w:r>
-        <w:rPr>
-          <w:b/>
-          <w:color w:val="0477BF"/>
-        </w:rPr>
-        <w:t xml:space="preserve">Week 1 — Architecture &amp; Core Design: </w:t>
-      </w:r>
-      <w:r>
-        <w:t>Finalize brand colors, emblems, navigation structure, and home portal framework.</w:t>
-      </w:r>
-    </w:p>
-    <w:p>
-      <w:pPr>
-        <w:pStyle w:val="ListBullet"/>
-        <w:spacing w:before="40" w:after="80" w:line="276" w:lineRule="auto"/>
-      </w:pPr>
-      <w:r>
-        <w:rPr>
-          <w:b/>
-          <w:color w:val="0477BF"/>
-        </w:rPr>
-        <w:t xml:space="preserve">Week 2 — Feature Engineering &amp; Content: </w:t>
-      </w:r>
-      <w:r>
-        <w:t>Build schedule calendar, ACBL results hub, digital partnership desk, education center, and governance pages.</w:t>
-      </w:r>
-    </w:p>
-    <w:p>
-      <w:pPr>
-        <w:pStyle w:val="ListBullet"/>
-        <w:spacing w:before="40" w:after="80" w:line="276" w:lineRule="auto"/>
-      </w:pPr>
-      <w:r>
-        <w:rPr>
-          <w:b/>
-          <w:color w:val="0477BF"/>
-        </w:rPr>
-        <w:t xml:space="preserve">Week 3 — Board Preview &amp; Accessibility Review: </w:t>
-      </w:r>
-      <w:r>
-        <w:t>Present interactive staging build to club leadership; conduct readability and mobile device testing.</w:t>
-      </w:r>
-    </w:p>
-    <w:p>
-      <w:pPr>
-        <w:pStyle w:val="ListBullet"/>
-        <w:spacing w:before="40" w:after="80" w:line="276" w:lineRule="auto"/>
-      </w:pPr>
-      <w:r>
-        <w:rPr>
-          <w:b/>
-          <w:color w:val="0477BF"/>
-        </w:rPr>
-        <w:t xml:space="preserve">Week 4 — Final Polish &amp; Launch: </w:t>
-      </w:r>
-      <w:r>
-        <w:t>Configure custom domain, conduct final quality assurance, and publish official website live.</w:t>
-      </w:r>
-    </w:p>
-    <w:p>
-      <w:pPr>
-        <w:spacing w:before="400" w:after="120"/>
-      </w:pPr>
-      <w:r>
-        <w:rPr>
-          <w:b/>
-          <w:color w:val="024873"/>
-          <w:sz w:val="28"/>
-        </w:rPr>
-        <w:t>6. Proposal Acceptance &amp; Authorization</w:t>
-      </w:r>
-    </w:p>
-    <w:p>
-      <w:pPr>
-        <w:spacing w:after="280" w:line="276" w:lineRule="auto"/>
-      </w:pPr>
-      <w:r>
-        <w:t>To approve this estimate and authorize the website development project, please sign below and return a copy.</w:t>
+        <w:t>To approve this estimate and authorize project completion, please sign below:</w:t>
       </w:r>
     </w:p>
     <w:tbl>
@@ -1546,10 +848,10 @@
             <w:tcW w:type="dxa" w:w="4608"/>
             <w:shd w:fill="FFFFFF"/>
             <w:tcMar>
-              <w:top w:w="140" w:type="dxa"/>
-              <w:bottom w:w="140" w:type="dxa"/>
-              <w:left w:w="140" w:type="dxa"/>
-              <w:right w:w="140" w:type="dxa"/>
+              <w:top w:w="120" w:type="dxa"/>
+              <w:bottom w:w="120" w:type="dxa"/>
+              <w:left w:w="120" w:type="dxa"/>
+              <w:right w:w="120" w:type="dxa"/>
             </w:tcMar>
           </w:tcPr>
           <w:p>
@@ -1558,6 +860,7 @@
             </w:pPr>
             <w:r>
               <w:rPr>
+                <w:rFonts w:ascii="Calibri" w:hAnsi="Calibri"/>
                 <w:color w:val="0F172A"/>
                 <w:sz w:val="19"/>
               </w:rPr>
@@ -1583,10 +886,10 @@
             <w:tcW w:type="dxa" w:w="4752"/>
             <w:shd w:fill="FFFFFF"/>
             <w:tcMar>
-              <w:top w:w="140" w:type="dxa"/>
-              <w:bottom w:w="140" w:type="dxa"/>
-              <w:left w:w="140" w:type="dxa"/>
-              <w:right w:w="140" w:type="dxa"/>
+              <w:top w:w="120" w:type="dxa"/>
+              <w:bottom w:w="120" w:type="dxa"/>
+              <w:left w:w="120" w:type="dxa"/>
+              <w:right w:w="120" w:type="dxa"/>
             </w:tcMar>
           </w:tcPr>
           <w:p>
@@ -1595,10 +898,11 @@
             </w:pPr>
             <w:r>
               <w:rPr>
+                <w:rFonts w:ascii="Calibri" w:hAnsi="Calibri"/>
                 <w:color w:val="0F172A"/>
                 <w:sz w:val="19"/>
               </w:rPr>
-              <w:t>ACCEPTED BY DEVELOPER:</w:t>
+              <w:t>DEVELOPER CONFIRMATION:</w:t>
               <w:br/>
               <w:br/>
               <w:t>_________________________________________</w:t>
@@ -1611,20 +915,6 @@
               <w:t>Date: August 10, 2026</w:t>
             </w:r>
           </w:p>
-        </w:tc>
-      </w:tr>
-      <w:tr>
-        <w:tc>
-          <w:tcPr>
-            <w:tcW w:type="dxa" w:w="4680"/>
-          </w:tcPr>
-          <w:p/>
-        </w:tc>
-        <w:tc>
-          <w:tcPr>
-            <w:tcW w:type="dxa" w:w="4680"/>
-          </w:tcPr>
-          <w:p/>
         </w:tc>
       </w:tr>
     </w:tbl>
@@ -2001,11 +1291,6 @@
     <w:name w:val="Normal"/>
     <w:qFormat/>
     <w:rsid w:val="00FC693F"/>
-    <w:rPr>
-      <w:rFonts w:ascii="Calibri" w:hAnsi="Calibri"/>
-      <w:color w:val="0F172A"/>
-      <w:sz w:val="22"/>
-    </w:rPr>
   </w:style>
   <w:style w:type="paragraph" w:styleId="Header">
     <w:name w:val="header"/>

</xml_diff>